<commit_message>
Refactor faculty assignment management: Updated API calls to include status filtering, improved advising profile data handling, and renamed UI components for clarity. Adjusted navigation paths and removed unused states for a cleaner codebase.
</commit_message>
<xml_diff>
--- a/backend/templates/KLD_Advising_Form.docx
+++ b/backend/templates/KLD_Advising_Form.docx
@@ -46,6 +46,7 @@
                 <w:szCs w:val="22"/>
               </w:rPr>
             </w:pPr>
+            <w:proofErr w:type="gramStart"/>
             <w:r>
               <w:rPr>
                 <w:sz w:val="22"/>
@@ -53,6 +54,7 @@
               </w:rPr>
               <w:t>Name :</w:t>
             </w:r>
+            <w:proofErr w:type="gramEnd"/>
             <w:r>
               <w:rPr>
                 <w:sz w:val="22"/>
@@ -65,7 +67,23 @@
                 <w:sz w:val="22"/>
                 <w:szCs w:val="22"/>
               </w:rPr>
-              <w:t>${student_name}</w:t>
+              <w:t>${</w:t>
+            </w:r>
+            <w:proofErr w:type="spellStart"/>
+            <w:r>
+              <w:rPr>
+                <w:sz w:val="22"/>
+                <w:szCs w:val="22"/>
+              </w:rPr>
+              <w:t>student_name</w:t>
+            </w:r>
+            <w:proofErr w:type="spellEnd"/>
+            <w:r>
+              <w:rPr>
+                <w:sz w:val="22"/>
+                <w:szCs w:val="22"/>
+              </w:rPr>
+              <w:t>}</w:t>
             </w:r>
           </w:p>
         </w:tc>
@@ -93,8 +111,17 @@
                 <w:sz w:val="22"/>
                 <w:szCs w:val="22"/>
               </w:rPr>
-              <w:t>Student No. :</w:t>
-            </w:r>
+              <w:t xml:space="preserve">Student </w:t>
+            </w:r>
+            <w:proofErr w:type="gramStart"/>
+            <w:r>
+              <w:rPr>
+                <w:sz w:val="22"/>
+                <w:szCs w:val="22"/>
+              </w:rPr>
+              <w:t>No. :</w:t>
+            </w:r>
+            <w:proofErr w:type="gramEnd"/>
             <w:r>
               <w:rPr>
                 <w:sz w:val="22"/>
@@ -107,7 +134,23 @@
                 <w:sz w:val="22"/>
                 <w:szCs w:val="22"/>
               </w:rPr>
-              <w:t>${student_number}</w:t>
+              <w:t>${</w:t>
+            </w:r>
+            <w:proofErr w:type="spellStart"/>
+            <w:r>
+              <w:rPr>
+                <w:sz w:val="22"/>
+                <w:szCs w:val="22"/>
+              </w:rPr>
+              <w:t>student_number</w:t>
+            </w:r>
+            <w:proofErr w:type="spellEnd"/>
+            <w:r>
+              <w:rPr>
+                <w:sz w:val="22"/>
+                <w:szCs w:val="22"/>
+              </w:rPr>
+              <w:t>}</w:t>
             </w:r>
           </w:p>
         </w:tc>
@@ -135,6 +178,7 @@
                 <w:szCs w:val="22"/>
               </w:rPr>
             </w:pPr>
+            <w:proofErr w:type="gramStart"/>
             <w:r>
               <w:rPr>
                 <w:sz w:val="22"/>
@@ -142,6 +186,7 @@
               </w:rPr>
               <w:t>Institute :</w:t>
             </w:r>
+            <w:proofErr w:type="gramEnd"/>
             <w:r>
               <w:rPr>
                 <w:sz w:val="22"/>
@@ -154,7 +199,23 @@
                 <w:sz w:val="22"/>
                 <w:szCs w:val="22"/>
               </w:rPr>
-              <w:t>${institute_name}</w:t>
+              <w:t>${</w:t>
+            </w:r>
+            <w:proofErr w:type="spellStart"/>
+            <w:r>
+              <w:rPr>
+                <w:sz w:val="22"/>
+                <w:szCs w:val="22"/>
+              </w:rPr>
+              <w:t>institute_name</w:t>
+            </w:r>
+            <w:proofErr w:type="spellEnd"/>
+            <w:r>
+              <w:rPr>
+                <w:sz w:val="22"/>
+                <w:szCs w:val="22"/>
+              </w:rPr>
+              <w:t>}</w:t>
             </w:r>
           </w:p>
         </w:tc>
@@ -182,15 +243,24 @@
                 <w:sz w:val="22"/>
                 <w:szCs w:val="22"/>
               </w:rPr>
-              <w:t xml:space="preserve">Program/Year/Section </w:t>
-            </w:r>
-            <w:r>
-              <w:rPr>
-                <w:sz w:val="22"/>
-                <w:szCs w:val="22"/>
-              </w:rPr>
-              <w:t xml:space="preserve">: </w:t>
-            </w:r>
+              <w:t>Program/Year/</w:t>
+            </w:r>
+            <w:proofErr w:type="gramStart"/>
+            <w:r>
+              <w:rPr>
+                <w:sz w:val="22"/>
+                <w:szCs w:val="22"/>
+              </w:rPr>
+              <w:t xml:space="preserve">Section </w:t>
+            </w:r>
+            <w:r>
+              <w:rPr>
+                <w:sz w:val="22"/>
+                <w:szCs w:val="22"/>
+              </w:rPr>
+              <w:t>:</w:t>
+            </w:r>
+            <w:proofErr w:type="gramEnd"/>
             <w:r>
               <w:rPr>
                 <w:sz w:val="22"/>
@@ -203,7 +273,30 @@
                 <w:sz w:val="22"/>
                 <w:szCs w:val="22"/>
               </w:rPr>
-              <w:t>${section_name}</w:t>
+              <w:t xml:space="preserve"> </w:t>
+            </w:r>
+            <w:r>
+              <w:rPr>
+                <w:sz w:val="22"/>
+                <w:szCs w:val="22"/>
+              </w:rPr>
+              <w:t>${</w:t>
+            </w:r>
+            <w:proofErr w:type="spellStart"/>
+            <w:r>
+              <w:rPr>
+                <w:sz w:val="22"/>
+                <w:szCs w:val="22"/>
+              </w:rPr>
+              <w:t>section_name</w:t>
+            </w:r>
+            <w:proofErr w:type="spellEnd"/>
+            <w:r>
+              <w:rPr>
+                <w:sz w:val="22"/>
+                <w:szCs w:val="22"/>
+              </w:rPr>
+              <w:t>}</w:t>
             </w:r>
           </w:p>
         </w:tc>
@@ -220,6 +313,7 @@
             <w:vAlign w:val="center"/>
           </w:tcPr>
           <w:p>
+            <w:proofErr w:type="gramStart"/>
             <w:r>
               <w:rPr>
                 <w:sz w:val="22"/>
@@ -227,6 +321,7 @@
               </w:rPr>
               <w:t>Status :</w:t>
             </w:r>
+            <w:proofErr w:type="gramEnd"/>
             <w:r>
               <w:rPr>
                 <w:sz w:val="22"/>
@@ -239,7 +334,23 @@
                 <w:sz w:val="22"/>
                 <w:szCs w:val="22"/>
               </w:rPr>
-              <w:t>${student_status}</w:t>
+              <w:t>${</w:t>
+            </w:r>
+            <w:proofErr w:type="spellStart"/>
+            <w:r>
+              <w:rPr>
+                <w:sz w:val="22"/>
+                <w:szCs w:val="22"/>
+              </w:rPr>
+              <w:t>student_status</w:t>
+            </w:r>
+            <w:proofErr w:type="spellEnd"/>
+            <w:r>
+              <w:rPr>
+                <w:sz w:val="22"/>
+                <w:szCs w:val="22"/>
+              </w:rPr>
+              <w:t>}</w:t>
             </w:r>
           </w:p>
         </w:tc>
@@ -272,8 +383,17 @@
                 <w:sz w:val="22"/>
                 <w:szCs w:val="22"/>
               </w:rPr>
-              <w:t>LAST ENROLLMENT :</w:t>
-            </w:r>
+              <w:t xml:space="preserve">LAST </w:t>
+            </w:r>
+            <w:proofErr w:type="gramStart"/>
+            <w:r>
+              <w:rPr>
+                <w:sz w:val="22"/>
+                <w:szCs w:val="22"/>
+              </w:rPr>
+              <w:t>ENROLLMENT :</w:t>
+            </w:r>
+            <w:proofErr w:type="gramEnd"/>
             <w:r>
               <w:rPr>
                 <w:sz w:val="22"/>
@@ -286,7 +406,23 @@
                 <w:sz w:val="22"/>
                 <w:szCs w:val="22"/>
               </w:rPr>
-              <w:t>${last_enrollment_period}</w:t>
+              <w:t>${</w:t>
+            </w:r>
+            <w:proofErr w:type="spellStart"/>
+            <w:r>
+              <w:rPr>
+                <w:sz w:val="22"/>
+                <w:szCs w:val="22"/>
+              </w:rPr>
+              <w:t>last_enrollment_period</w:t>
+            </w:r>
+            <w:proofErr w:type="spellEnd"/>
+            <w:r>
+              <w:rPr>
+                <w:sz w:val="22"/>
+                <w:szCs w:val="22"/>
+              </w:rPr>
+              <w:t>}</w:t>
             </w:r>
           </w:p>
         </w:tc>
@@ -314,8 +450,17 @@
                 <w:sz w:val="22"/>
                 <w:szCs w:val="22"/>
               </w:rPr>
-              <w:t>CURRENT ENROLLMENT :</w:t>
-            </w:r>
+              <w:t xml:space="preserve">CURRENT </w:t>
+            </w:r>
+            <w:proofErr w:type="gramStart"/>
+            <w:r>
+              <w:rPr>
+                <w:sz w:val="22"/>
+                <w:szCs w:val="22"/>
+              </w:rPr>
+              <w:t>ENROLLMENT :</w:t>
+            </w:r>
+            <w:proofErr w:type="gramEnd"/>
             <w:r>
               <w:rPr>
                 <w:sz w:val="22"/>
@@ -328,7 +473,23 @@
                 <w:sz w:val="22"/>
                 <w:szCs w:val="22"/>
               </w:rPr>
-              <w:t>${current_enrollment_period}</w:t>
+              <w:t>${</w:t>
+            </w:r>
+            <w:proofErr w:type="spellStart"/>
+            <w:r>
+              <w:rPr>
+                <w:sz w:val="22"/>
+                <w:szCs w:val="22"/>
+              </w:rPr>
+              <w:t>current_enrollment_period</w:t>
+            </w:r>
+            <w:proofErr w:type="spellEnd"/>
+            <w:r>
+              <w:rPr>
+                <w:sz w:val="22"/>
+                <w:szCs w:val="22"/>
+              </w:rPr>
+              <w:t>}</w:t>
             </w:r>
           </w:p>
         </w:tc>
@@ -433,7 +594,23 @@
                 <w:sz w:val="22"/>
                 <w:szCs w:val="22"/>
               </w:rPr>
-              <w:t>(0 if Failed)</w:t>
+              <w:t xml:space="preserve">(0 if </w:t>
+            </w:r>
+            <w:proofErr w:type="gramStart"/>
+            <w:r>
+              <w:rPr>
+                <w:sz w:val="22"/>
+                <w:szCs w:val="22"/>
+              </w:rPr>
+              <w:t>Failed</w:t>
+            </w:r>
+            <w:proofErr w:type="gramEnd"/>
+            <w:r>
+              <w:rPr>
+                <w:sz w:val="22"/>
+                <w:szCs w:val="22"/>
+              </w:rPr>
+              <w:t>)</w:t>
             </w:r>
           </w:p>
         </w:tc>
@@ -552,7 +729,6 @@
       </w:tr>
       <w:tr>
         <w:trPr>
-          <w:cantSplit/>
           <w:trHeight w:hRule="exact" w:val="259"/>
         </w:trPr>
         <w:tc>
@@ -581,7 +757,23 @@
                 <w:sz w:val="22"/>
                 <w:szCs w:val="22"/>
               </w:rPr>
-              <w:t>${gc_code}</w:t>
+              <w:t>${</w:t>
+            </w:r>
+            <w:proofErr w:type="spellStart"/>
+            <w:r>
+              <w:rPr>
+                <w:sz w:val="22"/>
+                <w:szCs w:val="22"/>
+              </w:rPr>
+              <w:t>gc_code</w:t>
+            </w:r>
+            <w:proofErr w:type="spellEnd"/>
+            <w:r>
+              <w:rPr>
+                <w:sz w:val="22"/>
+                <w:szCs w:val="22"/>
+              </w:rPr>
+              <w:t>}</w:t>
             </w:r>
           </w:p>
         </w:tc>
@@ -594,6 +786,7 @@
               <w:bottom w:w="14" w:type="dxa"/>
               <w:right w:w="115" w:type="dxa"/>
             </w:tcMar>
+            <w:vAlign w:val="center"/>
           </w:tcPr>
           <w:p>
             <w:pPr>
@@ -609,7 +802,25 @@
                 <w:sz w:val="22"/>
                 <w:szCs w:val="22"/>
               </w:rPr>
-              <w:t xml:space="preserve">${gc_title_normal} </w:t>
+              <w:t>${</w:t>
+            </w:r>
+            <w:proofErr w:type="spellStart"/>
+            <w:r>
+              <w:rPr>
+                <w:kern w:val="0"/>
+                <w:sz w:val="22"/>
+                <w:szCs w:val="22"/>
+              </w:rPr>
+              <w:t>gc_title_normal</w:t>
+            </w:r>
+            <w:proofErr w:type="spellEnd"/>
+            <w:r>
+              <w:rPr>
+                <w:kern w:val="0"/>
+                <w:sz w:val="22"/>
+                <w:szCs w:val="22"/>
+              </w:rPr>
+              <w:t xml:space="preserve">} </w:t>
             </w:r>
             <w:r>
               <w:rPr>
@@ -617,164 +828,225 @@
                 <w:sz w:val="12"/>
                 <w:szCs w:val="12"/>
               </w:rPr>
-              <w:t>${gc_title_small}</w:t>
-            </w:r>
-          </w:p>
-          <w:p>
-            <w:pPr>
-              <w:rPr>
-                <w:sz w:val="22"/>
-                <w:szCs w:val="22"/>
-              </w:rPr>
-            </w:pPr>
-          </w:p>
-        </w:tc>
-        <w:tc>
-          <w:tcPr>
-            <w:tcW w:w="1530" w:type="dxa"/>
-            <w:tcMar>
-              <w:top w:w="0" w:type="dxa"/>
-              <w:left w:w="115" w:type="dxa"/>
-              <w:bottom w:w="14" w:type="dxa"/>
-              <w:right w:w="115" w:type="dxa"/>
-            </w:tcMar>
-            <w:vAlign w:val="center"/>
-          </w:tcPr>
-          <w:p>
-            <w:pPr>
-              <w:jc w:val="center"/>
-              <w:rPr>
-                <w:sz w:val="22"/>
-                <w:szCs w:val="22"/>
-              </w:rPr>
-            </w:pPr>
-            <w:r>
-              <w:rPr>
-                <w:sz w:val="22"/>
-                <w:szCs w:val="22"/>
-              </w:rPr>
-              <w:t>${gc_units}</w:t>
-            </w:r>
-          </w:p>
-        </w:tc>
-        <w:tc>
-          <w:tcPr>
-            <w:tcW w:w="1116" w:type="dxa"/>
-            <w:tcMar>
-              <w:top w:w="0" w:type="dxa"/>
-              <w:left w:w="115" w:type="dxa"/>
-              <w:bottom w:w="14" w:type="dxa"/>
-              <w:right w:w="115" w:type="dxa"/>
-            </w:tcMar>
-            <w:vAlign w:val="center"/>
-          </w:tcPr>
-          <w:p>
-            <w:pPr>
-              <w:rPr>
-                <w:sz w:val="22"/>
-                <w:szCs w:val="22"/>
-              </w:rPr>
-            </w:pPr>
-            <w:r>
-              <w:rPr>
-                <w:sz w:val="22"/>
-                <w:szCs w:val="22"/>
-              </w:rPr>
-              <w:t>${gc_prereq}</w:t>
-            </w:r>
-          </w:p>
-        </w:tc>
-        <w:tc>
-          <w:tcPr>
-            <w:tcW w:w="954" w:type="dxa"/>
-            <w:tcMar>
-              <w:top w:w="0" w:type="dxa"/>
-              <w:left w:w="115" w:type="dxa"/>
-              <w:bottom w:w="14" w:type="dxa"/>
-              <w:right w:w="115" w:type="dxa"/>
-            </w:tcMar>
-            <w:vAlign w:val="center"/>
-          </w:tcPr>
-          <w:p>
-            <w:pPr>
-              <w:rPr>
-                <w:sz w:val="22"/>
-                <w:szCs w:val="22"/>
-              </w:rPr>
-            </w:pPr>
-            <w:r>
-              <w:rPr>
-                <w:sz w:val="22"/>
-                <w:szCs w:val="22"/>
-              </w:rPr>
-              <w:t>${ac_code}</w:t>
-            </w:r>
-          </w:p>
-        </w:tc>
-        <w:tc>
-          <w:tcPr>
-            <w:tcW w:w="3330" w:type="dxa"/>
-            <w:tcMar>
-              <w:top w:w="0" w:type="dxa"/>
-              <w:left w:w="115" w:type="dxa"/>
-              <w:bottom w:w="14" w:type="dxa"/>
-              <w:right w:w="115" w:type="dxa"/>
-            </w:tcMar>
-          </w:tcPr>
-          <w:p>
-            <w:pPr>
-              <w:rPr>
-                <w:sz w:val="22"/>
-                <w:szCs w:val="22"/>
-              </w:rPr>
-            </w:pPr>
-            <w:r>
-              <w:rPr>
-                <w:kern w:val="0"/>
-                <w:sz w:val="22"/>
-                <w:szCs w:val="22"/>
-              </w:rPr>
-              <w:t>${ac_title</w:t>
-            </w:r>
-            <w:r>
-              <w:rPr>
-                <w:kern w:val="0"/>
-                <w:sz w:val="22"/>
-                <w:szCs w:val="22"/>
-              </w:rPr>
-              <w:t>_normal</w:t>
-            </w:r>
-            <w:r>
-              <w:rPr>
-                <w:kern w:val="0"/>
-                <w:sz w:val="22"/>
-                <w:szCs w:val="22"/>
-              </w:rPr>
-              <w:t>}</w:t>
-            </w:r>
-            <w:r>
-              <w:rPr>
-                <w:kern w:val="0"/>
-                <w:sz w:val="22"/>
-                <w:szCs w:val="22"/>
-              </w:rPr>
-              <w:t xml:space="preserve"> </w:t>
-            </w:r>
+              <w:t>${</w:t>
+            </w:r>
+            <w:proofErr w:type="spellStart"/>
             <w:r>
               <w:rPr>
                 <w:kern w:val="0"/>
                 <w:sz w:val="12"/>
                 <w:szCs w:val="12"/>
               </w:rPr>
-              <w:t>${</w:t>
-            </w:r>
+              <w:t>gc_title_small</w:t>
+            </w:r>
+            <w:proofErr w:type="spellEnd"/>
             <w:r>
               <w:rPr>
                 <w:kern w:val="0"/>
                 <w:sz w:val="12"/>
                 <w:szCs w:val="12"/>
               </w:rPr>
-              <w:t>a</w:t>
+              <w:t>}</w:t>
+            </w:r>
+          </w:p>
+          <w:p>
+            <w:pPr>
+              <w:rPr>
+                <w:sz w:val="22"/>
+                <w:szCs w:val="22"/>
+              </w:rPr>
+            </w:pPr>
+          </w:p>
+        </w:tc>
+        <w:tc>
+          <w:tcPr>
+            <w:tcW w:w="1530" w:type="dxa"/>
+            <w:tcMar>
+              <w:top w:w="0" w:type="dxa"/>
+              <w:left w:w="115" w:type="dxa"/>
+              <w:bottom w:w="14" w:type="dxa"/>
+              <w:right w:w="115" w:type="dxa"/>
+            </w:tcMar>
+            <w:vAlign w:val="center"/>
+          </w:tcPr>
+          <w:p>
+            <w:pPr>
+              <w:jc w:val="center"/>
+              <w:rPr>
+                <w:sz w:val="22"/>
+                <w:szCs w:val="22"/>
+              </w:rPr>
+            </w:pPr>
+            <w:r>
+              <w:rPr>
+                <w:sz w:val="22"/>
+                <w:szCs w:val="22"/>
+              </w:rPr>
+              <w:t>${</w:t>
+            </w:r>
+            <w:proofErr w:type="spellStart"/>
+            <w:r>
+              <w:rPr>
+                <w:sz w:val="22"/>
+                <w:szCs w:val="22"/>
+              </w:rPr>
+              <w:t>gc_units</w:t>
+            </w:r>
+            <w:proofErr w:type="spellEnd"/>
+            <w:r>
+              <w:rPr>
+                <w:sz w:val="22"/>
+                <w:szCs w:val="22"/>
+              </w:rPr>
+              <w:t>}</w:t>
+            </w:r>
+          </w:p>
+        </w:tc>
+        <w:tc>
+          <w:tcPr>
+            <w:tcW w:w="1116" w:type="dxa"/>
+            <w:tcMar>
+              <w:top w:w="0" w:type="dxa"/>
+              <w:left w:w="115" w:type="dxa"/>
+              <w:bottom w:w="14" w:type="dxa"/>
+              <w:right w:w="115" w:type="dxa"/>
+            </w:tcMar>
+            <w:vAlign w:val="center"/>
+          </w:tcPr>
+          <w:p>
+            <w:pPr>
+              <w:rPr>
+                <w:sz w:val="22"/>
+                <w:szCs w:val="22"/>
+              </w:rPr>
+            </w:pPr>
+            <w:r>
+              <w:rPr>
+                <w:sz w:val="22"/>
+                <w:szCs w:val="22"/>
+              </w:rPr>
+              <w:t>${</w:t>
+            </w:r>
+            <w:proofErr w:type="spellStart"/>
+            <w:r>
+              <w:rPr>
+                <w:sz w:val="22"/>
+                <w:szCs w:val="22"/>
+              </w:rPr>
+              <w:t>gc_prereq</w:t>
+            </w:r>
+            <w:proofErr w:type="spellEnd"/>
+            <w:r>
+              <w:rPr>
+                <w:sz w:val="22"/>
+                <w:szCs w:val="22"/>
+              </w:rPr>
+              <w:t>}</w:t>
+            </w:r>
+          </w:p>
+        </w:tc>
+        <w:tc>
+          <w:tcPr>
+            <w:tcW w:w="954" w:type="dxa"/>
+            <w:tcMar>
+              <w:top w:w="0" w:type="dxa"/>
+              <w:left w:w="115" w:type="dxa"/>
+              <w:bottom w:w="14" w:type="dxa"/>
+              <w:right w:w="115" w:type="dxa"/>
+            </w:tcMar>
+            <w:vAlign w:val="center"/>
+          </w:tcPr>
+          <w:p>
+            <w:pPr>
+              <w:rPr>
+                <w:sz w:val="22"/>
+                <w:szCs w:val="22"/>
+              </w:rPr>
+            </w:pPr>
+            <w:r>
+              <w:rPr>
+                <w:sz w:val="22"/>
+                <w:szCs w:val="22"/>
+              </w:rPr>
+              <w:t>${</w:t>
+            </w:r>
+            <w:proofErr w:type="spellStart"/>
+            <w:r>
+              <w:rPr>
+                <w:sz w:val="22"/>
+                <w:szCs w:val="22"/>
+              </w:rPr>
+              <w:t>ac_code</w:t>
+            </w:r>
+            <w:proofErr w:type="spellEnd"/>
+            <w:r>
+              <w:rPr>
+                <w:sz w:val="22"/>
+                <w:szCs w:val="22"/>
+              </w:rPr>
+              <w:t>}</w:t>
+            </w:r>
+          </w:p>
+        </w:tc>
+        <w:tc>
+          <w:tcPr>
+            <w:tcW w:w="3330" w:type="dxa"/>
+            <w:tcMar>
+              <w:top w:w="0" w:type="dxa"/>
+              <w:left w:w="115" w:type="dxa"/>
+              <w:bottom w:w="14" w:type="dxa"/>
+              <w:right w:w="115" w:type="dxa"/>
+            </w:tcMar>
+            <w:vAlign w:val="center"/>
+          </w:tcPr>
+          <w:p>
+            <w:pPr>
+              <w:rPr>
+                <w:sz w:val="22"/>
+                <w:szCs w:val="22"/>
+              </w:rPr>
+            </w:pPr>
+            <w:r>
+              <w:rPr>
+                <w:kern w:val="0"/>
+                <w:sz w:val="22"/>
+                <w:szCs w:val="22"/>
+              </w:rPr>
+              <w:t>${</w:t>
+            </w:r>
+            <w:proofErr w:type="spellStart"/>
+            <w:r>
+              <w:rPr>
+                <w:kern w:val="0"/>
+                <w:sz w:val="22"/>
+                <w:szCs w:val="22"/>
+              </w:rPr>
+              <w:t>ac_title</w:t>
+            </w:r>
+            <w:r>
+              <w:rPr>
+                <w:kern w:val="0"/>
+                <w:sz w:val="22"/>
+                <w:szCs w:val="22"/>
+              </w:rPr>
+              <w:t>_normal</w:t>
+            </w:r>
+            <w:proofErr w:type="spellEnd"/>
+            <w:r>
+              <w:rPr>
+                <w:kern w:val="0"/>
+                <w:sz w:val="22"/>
+                <w:szCs w:val="22"/>
+              </w:rPr>
+              <w:t>}</w:t>
+            </w:r>
+            <w:r>
+              <w:rPr>
+                <w:kern w:val="0"/>
+                <w:sz w:val="22"/>
+                <w:szCs w:val="22"/>
+              </w:rPr>
+              <w:t xml:space="preserve"> </w:t>
             </w:r>
             <w:r>
               <w:rPr>
@@ -782,7 +1054,33 @@
                 <w:sz w:val="12"/>
                 <w:szCs w:val="12"/>
               </w:rPr>
-              <w:t>c_title_small}</w:t>
+              <w:t>${</w:t>
+            </w:r>
+            <w:proofErr w:type="spellStart"/>
+            <w:r>
+              <w:rPr>
+                <w:kern w:val="0"/>
+                <w:sz w:val="12"/>
+                <w:szCs w:val="12"/>
+              </w:rPr>
+              <w:t>a</w:t>
+            </w:r>
+            <w:r>
+              <w:rPr>
+                <w:kern w:val="0"/>
+                <w:sz w:val="12"/>
+                <w:szCs w:val="12"/>
+              </w:rPr>
+              <w:t>c_title_small</w:t>
+            </w:r>
+            <w:proofErr w:type="spellEnd"/>
+            <w:r>
+              <w:rPr>
+                <w:kern w:val="0"/>
+                <w:sz w:val="12"/>
+                <w:szCs w:val="12"/>
+              </w:rPr>
+              <w:t>}</w:t>
             </w:r>
           </w:p>
         </w:tc>
@@ -810,7 +1108,23 @@
                 <w:sz w:val="22"/>
                 <w:szCs w:val="22"/>
               </w:rPr>
-              <w:t>${ac_units}</w:t>
+              <w:t>${</w:t>
+            </w:r>
+            <w:proofErr w:type="spellStart"/>
+            <w:r>
+              <w:rPr>
+                <w:sz w:val="22"/>
+                <w:szCs w:val="22"/>
+              </w:rPr>
+              <w:t>ac_units</w:t>
+            </w:r>
+            <w:proofErr w:type="spellEnd"/>
+            <w:r>
+              <w:rPr>
+                <w:sz w:val="22"/>
+                <w:szCs w:val="22"/>
+              </w:rPr>
+              <w:t>}</w:t>
             </w:r>
           </w:p>
         </w:tc>
@@ -860,7 +1174,23 @@
                 <w:sz w:val="22"/>
                 <w:szCs w:val="22"/>
               </w:rPr>
-              <w:t>${total_units_earned}</w:t>
+              <w:t>${</w:t>
+            </w:r>
+            <w:proofErr w:type="spellStart"/>
+            <w:r>
+              <w:rPr>
+                <w:sz w:val="22"/>
+                <w:szCs w:val="22"/>
+              </w:rPr>
+              <w:t>total_units_earned</w:t>
+            </w:r>
+            <w:proofErr w:type="spellEnd"/>
+            <w:r>
+              <w:rPr>
+                <w:sz w:val="22"/>
+                <w:szCs w:val="22"/>
+              </w:rPr>
+              <w:t>}</w:t>
             </w:r>
           </w:p>
         </w:tc>
@@ -888,8 +1218,17 @@
                 <w:sz w:val="22"/>
                 <w:szCs w:val="22"/>
               </w:rPr>
-              <w:t>Total number of units to be enrolled :</w:t>
-            </w:r>
+              <w:t xml:space="preserve">Total number of units to be </w:t>
+            </w:r>
+            <w:proofErr w:type="gramStart"/>
+            <w:r>
+              <w:rPr>
+                <w:sz w:val="22"/>
+                <w:szCs w:val="22"/>
+              </w:rPr>
+              <w:t>enrolled :</w:t>
+            </w:r>
+            <w:proofErr w:type="gramEnd"/>
             <w:r>
               <w:rPr>
                 <w:sz w:val="22"/>
@@ -902,7 +1241,23 @@
                 <w:sz w:val="22"/>
                 <w:szCs w:val="22"/>
               </w:rPr>
-              <w:t>${total_units_to_enroll}</w:t>
+              <w:t>${</w:t>
+            </w:r>
+            <w:proofErr w:type="spellStart"/>
+            <w:r>
+              <w:rPr>
+                <w:sz w:val="22"/>
+                <w:szCs w:val="22"/>
+              </w:rPr>
+              <w:t>total_units_to_enroll</w:t>
+            </w:r>
+            <w:proofErr w:type="spellEnd"/>
+            <w:r>
+              <w:rPr>
+                <w:sz w:val="22"/>
+                <w:szCs w:val="22"/>
+              </w:rPr>
+              <w:t>}</w:t>
             </w:r>
           </w:p>
         </w:tc>
@@ -939,7 +1294,23 @@
                 <w:sz w:val="22"/>
                 <w:szCs w:val="22"/>
               </w:rPr>
-              <w:t xml:space="preserve">Student’s Signature : </w:t>
+              <w:t xml:space="preserve">Student’s </w:t>
+            </w:r>
+            <w:proofErr w:type="gramStart"/>
+            <w:r>
+              <w:rPr>
+                <w:sz w:val="22"/>
+                <w:szCs w:val="22"/>
+              </w:rPr>
+              <w:t>Signature :</w:t>
+            </w:r>
+            <w:proofErr w:type="gramEnd"/>
+            <w:r>
+              <w:rPr>
+                <w:sz w:val="22"/>
+                <w:szCs w:val="22"/>
+              </w:rPr>
+              <w:t xml:space="preserve"> </w:t>
             </w:r>
           </w:p>
         </w:tc>
@@ -967,8 +1338,17 @@
                 <w:sz w:val="22"/>
                 <w:szCs w:val="22"/>
               </w:rPr>
-              <w:t>Adviser’s printed Name :</w:t>
-            </w:r>
+              <w:t xml:space="preserve">Adviser’s printed </w:t>
+            </w:r>
+            <w:proofErr w:type="gramStart"/>
+            <w:r>
+              <w:rPr>
+                <w:sz w:val="22"/>
+                <w:szCs w:val="22"/>
+              </w:rPr>
+              <w:t>Name :</w:t>
+            </w:r>
+            <w:proofErr w:type="gramEnd"/>
             <w:r>
               <w:rPr>
                 <w:sz w:val="22"/>
@@ -981,7 +1361,23 @@
                 <w:sz w:val="22"/>
                 <w:szCs w:val="22"/>
               </w:rPr>
-              <w:t>${advisor_name}</w:t>
+              <w:t>${</w:t>
+            </w:r>
+            <w:proofErr w:type="spellStart"/>
+            <w:r>
+              <w:rPr>
+                <w:sz w:val="22"/>
+                <w:szCs w:val="22"/>
+              </w:rPr>
+              <w:t>advisor_name</w:t>
+            </w:r>
+            <w:proofErr w:type="spellEnd"/>
+            <w:r>
+              <w:rPr>
+                <w:sz w:val="22"/>
+                <w:szCs w:val="22"/>
+              </w:rPr>
+              <w:t>}</w:t>
             </w:r>
           </w:p>
         </w:tc>
@@ -1044,7 +1440,23 @@
                 <w:sz w:val="22"/>
                 <w:szCs w:val="22"/>
               </w:rPr>
-              <w:t xml:space="preserve">Adviser’s Signature : </w:t>
+              <w:t xml:space="preserve">Adviser’s </w:t>
+            </w:r>
+            <w:proofErr w:type="gramStart"/>
+            <w:r>
+              <w:rPr>
+                <w:sz w:val="22"/>
+                <w:szCs w:val="22"/>
+              </w:rPr>
+              <w:t>Signature :</w:t>
+            </w:r>
+            <w:proofErr w:type="gramEnd"/>
+            <w:r>
+              <w:rPr>
+                <w:sz w:val="22"/>
+                <w:szCs w:val="22"/>
+              </w:rPr>
+              <w:t xml:space="preserve"> </w:t>
             </w:r>
           </w:p>
         </w:tc>
@@ -1172,6 +1584,7 @@
                 <w:szCs w:val="22"/>
               </w:rPr>
             </w:pPr>
+            <w:proofErr w:type="gramStart"/>
             <w:r>
               <w:rPr>
                 <w:sz w:val="22"/>
@@ -1179,6 +1592,7 @@
               </w:rPr>
               <w:t>Name :</w:t>
             </w:r>
+            <w:proofErr w:type="gramEnd"/>
             <w:r>
               <w:rPr>
                 <w:sz w:val="22"/>
@@ -1191,7 +1605,23 @@
                 <w:sz w:val="22"/>
                 <w:szCs w:val="22"/>
               </w:rPr>
-              <w:t>${student_name}</w:t>
+              <w:t>${</w:t>
+            </w:r>
+            <w:proofErr w:type="spellStart"/>
+            <w:r>
+              <w:rPr>
+                <w:sz w:val="22"/>
+                <w:szCs w:val="22"/>
+              </w:rPr>
+              <w:t>student_name</w:t>
+            </w:r>
+            <w:proofErr w:type="spellEnd"/>
+            <w:r>
+              <w:rPr>
+                <w:sz w:val="22"/>
+                <w:szCs w:val="22"/>
+              </w:rPr>
+              <w:t>}</w:t>
             </w:r>
           </w:p>
         </w:tc>
@@ -1219,8 +1649,17 @@
                 <w:sz w:val="22"/>
                 <w:szCs w:val="22"/>
               </w:rPr>
-              <w:t>Student No. :</w:t>
-            </w:r>
+              <w:t xml:space="preserve">Student </w:t>
+            </w:r>
+            <w:proofErr w:type="gramStart"/>
+            <w:r>
+              <w:rPr>
+                <w:sz w:val="22"/>
+                <w:szCs w:val="22"/>
+              </w:rPr>
+              <w:t>No. :</w:t>
+            </w:r>
+            <w:proofErr w:type="gramEnd"/>
             <w:r>
               <w:rPr>
                 <w:sz w:val="22"/>
@@ -1233,7 +1672,23 @@
                 <w:sz w:val="22"/>
                 <w:szCs w:val="22"/>
               </w:rPr>
-              <w:t>${student_number}</w:t>
+              <w:t>${</w:t>
+            </w:r>
+            <w:proofErr w:type="spellStart"/>
+            <w:r>
+              <w:rPr>
+                <w:sz w:val="22"/>
+                <w:szCs w:val="22"/>
+              </w:rPr>
+              <w:t>student_number</w:t>
+            </w:r>
+            <w:proofErr w:type="spellEnd"/>
+            <w:r>
+              <w:rPr>
+                <w:sz w:val="22"/>
+                <w:szCs w:val="22"/>
+              </w:rPr>
+              <w:t>}</w:t>
             </w:r>
           </w:p>
         </w:tc>
@@ -1261,6 +1716,7 @@
                 <w:szCs w:val="22"/>
               </w:rPr>
             </w:pPr>
+            <w:proofErr w:type="gramStart"/>
             <w:r>
               <w:rPr>
                 <w:sz w:val="22"/>
@@ -1268,6 +1724,7 @@
               </w:rPr>
               <w:t>Institute :</w:t>
             </w:r>
+            <w:proofErr w:type="gramEnd"/>
             <w:r>
               <w:rPr>
                 <w:sz w:val="22"/>
@@ -1280,7 +1737,23 @@
                 <w:sz w:val="22"/>
                 <w:szCs w:val="22"/>
               </w:rPr>
-              <w:t>${institute_name}</w:t>
+              <w:t>${</w:t>
+            </w:r>
+            <w:proofErr w:type="spellStart"/>
+            <w:r>
+              <w:rPr>
+                <w:sz w:val="22"/>
+                <w:szCs w:val="22"/>
+              </w:rPr>
+              <w:t>institute_name</w:t>
+            </w:r>
+            <w:proofErr w:type="spellEnd"/>
+            <w:r>
+              <w:rPr>
+                <w:sz w:val="22"/>
+                <w:szCs w:val="22"/>
+              </w:rPr>
+              <w:t>}</w:t>
             </w:r>
           </w:p>
         </w:tc>
@@ -1308,21 +1781,53 @@
                 <w:sz w:val="22"/>
                 <w:szCs w:val="22"/>
               </w:rPr>
-              <w:t xml:space="preserve">Program/Year/Section </w:t>
-            </w:r>
-            <w:r>
-              <w:rPr>
-                <w:sz w:val="22"/>
-                <w:szCs w:val="22"/>
-              </w:rPr>
-              <w:t xml:space="preserve">:  </w:t>
-            </w:r>
-            <w:r>
-              <w:rPr>
-                <w:sz w:val="22"/>
-                <w:szCs w:val="22"/>
-              </w:rPr>
-              <w:t>${section_name}</w:t>
+              <w:t>Program/Year/</w:t>
+            </w:r>
+            <w:proofErr w:type="gramStart"/>
+            <w:r>
+              <w:rPr>
+                <w:sz w:val="22"/>
+                <w:szCs w:val="22"/>
+              </w:rPr>
+              <w:t xml:space="preserve">Section </w:t>
+            </w:r>
+            <w:r>
+              <w:rPr>
+                <w:sz w:val="22"/>
+                <w:szCs w:val="22"/>
+              </w:rPr>
+              <w:t>:</w:t>
+            </w:r>
+            <w:proofErr w:type="gramEnd"/>
+            <w:r>
+              <w:rPr>
+                <w:sz w:val="22"/>
+                <w:szCs w:val="22"/>
+              </w:rPr>
+              <w:t xml:space="preserve">  </w:t>
+            </w:r>
+            <w:r>
+              <w:rPr>
+                <w:sz w:val="22"/>
+                <w:szCs w:val="22"/>
+              </w:rPr>
+              <w:t>${</w:t>
+            </w:r>
+            <w:proofErr w:type="spellStart"/>
+            <w:r>
+              <w:rPr>
+                <w:sz w:val="22"/>
+                <w:szCs w:val="22"/>
+              </w:rPr>
+              <w:t>section_name</w:t>
+            </w:r>
+            <w:proofErr w:type="spellEnd"/>
+            <w:r>
+              <w:rPr>
+                <w:sz w:val="22"/>
+                <w:szCs w:val="22"/>
+              </w:rPr>
+              <w:t>}</w:t>
             </w:r>
           </w:p>
         </w:tc>
@@ -1339,6 +1844,7 @@
             <w:vAlign w:val="center"/>
           </w:tcPr>
           <w:p>
+            <w:proofErr w:type="gramStart"/>
             <w:r>
               <w:rPr>
                 <w:sz w:val="22"/>
@@ -1346,6 +1852,7 @@
               </w:rPr>
               <w:t>Status :</w:t>
             </w:r>
+            <w:proofErr w:type="gramEnd"/>
             <w:r>
               <w:rPr>
                 <w:sz w:val="22"/>
@@ -1358,7 +1865,23 @@
                 <w:sz w:val="22"/>
                 <w:szCs w:val="22"/>
               </w:rPr>
-              <w:t>${student_status}</w:t>
+              <w:t>${</w:t>
+            </w:r>
+            <w:proofErr w:type="spellStart"/>
+            <w:r>
+              <w:rPr>
+                <w:sz w:val="22"/>
+                <w:szCs w:val="22"/>
+              </w:rPr>
+              <w:t>student_status</w:t>
+            </w:r>
+            <w:proofErr w:type="spellEnd"/>
+            <w:r>
+              <w:rPr>
+                <w:sz w:val="22"/>
+                <w:szCs w:val="22"/>
+              </w:rPr>
+              <w:t>}</w:t>
             </w:r>
           </w:p>
         </w:tc>
@@ -1391,8 +1914,17 @@
                 <w:sz w:val="22"/>
                 <w:szCs w:val="22"/>
               </w:rPr>
-              <w:t>LAST ENROLLMENT :</w:t>
-            </w:r>
+              <w:t xml:space="preserve">LAST </w:t>
+            </w:r>
+            <w:proofErr w:type="gramStart"/>
+            <w:r>
+              <w:rPr>
+                <w:sz w:val="22"/>
+                <w:szCs w:val="22"/>
+              </w:rPr>
+              <w:t>ENROLLMENT :</w:t>
+            </w:r>
+            <w:proofErr w:type="gramEnd"/>
             <w:r>
               <w:rPr>
                 <w:sz w:val="22"/>
@@ -1405,7 +1937,23 @@
                 <w:sz w:val="22"/>
                 <w:szCs w:val="22"/>
               </w:rPr>
-              <w:t>${last_enrollment_period}</w:t>
+              <w:t>${</w:t>
+            </w:r>
+            <w:proofErr w:type="spellStart"/>
+            <w:r>
+              <w:rPr>
+                <w:sz w:val="22"/>
+                <w:szCs w:val="22"/>
+              </w:rPr>
+              <w:t>last_enrollment_period</w:t>
+            </w:r>
+            <w:proofErr w:type="spellEnd"/>
+            <w:r>
+              <w:rPr>
+                <w:sz w:val="22"/>
+                <w:szCs w:val="22"/>
+              </w:rPr>
+              <w:t>}</w:t>
             </w:r>
           </w:p>
         </w:tc>
@@ -1433,8 +1981,17 @@
                 <w:sz w:val="22"/>
                 <w:szCs w:val="22"/>
               </w:rPr>
-              <w:t>CURRENT ENROLLMENT :</w:t>
-            </w:r>
+              <w:t xml:space="preserve">CURRENT </w:t>
+            </w:r>
+            <w:proofErr w:type="gramStart"/>
+            <w:r>
+              <w:rPr>
+                <w:sz w:val="22"/>
+                <w:szCs w:val="22"/>
+              </w:rPr>
+              <w:t>ENROLLMENT :</w:t>
+            </w:r>
+            <w:proofErr w:type="gramEnd"/>
             <w:r>
               <w:rPr>
                 <w:sz w:val="22"/>
@@ -1447,7 +2004,23 @@
                 <w:sz w:val="22"/>
                 <w:szCs w:val="22"/>
               </w:rPr>
-              <w:t>${current_enrollment_period}</w:t>
+              <w:t>${</w:t>
+            </w:r>
+            <w:proofErr w:type="spellStart"/>
+            <w:r>
+              <w:rPr>
+                <w:sz w:val="22"/>
+                <w:szCs w:val="22"/>
+              </w:rPr>
+              <w:t>current_enrollment_period</w:t>
+            </w:r>
+            <w:proofErr w:type="spellEnd"/>
+            <w:r>
+              <w:rPr>
+                <w:sz w:val="22"/>
+                <w:szCs w:val="22"/>
+              </w:rPr>
+              <w:t>}</w:t>
             </w:r>
           </w:p>
         </w:tc>
@@ -1552,7 +2125,23 @@
                 <w:sz w:val="22"/>
                 <w:szCs w:val="22"/>
               </w:rPr>
-              <w:t>(0 if Failed)</w:t>
+              <w:t xml:space="preserve">(0 if </w:t>
+            </w:r>
+            <w:proofErr w:type="gramStart"/>
+            <w:r>
+              <w:rPr>
+                <w:sz w:val="22"/>
+                <w:szCs w:val="22"/>
+              </w:rPr>
+              <w:t>Failed</w:t>
+            </w:r>
+            <w:proofErr w:type="gramEnd"/>
+            <w:r>
+              <w:rPr>
+                <w:sz w:val="22"/>
+                <w:szCs w:val="22"/>
+              </w:rPr>
+              <w:t>)</w:t>
             </w:r>
           </w:p>
         </w:tc>
@@ -1671,7 +2260,6 @@
       </w:tr>
       <w:tr>
         <w:trPr>
-          <w:cantSplit/>
           <w:trHeight w:hRule="exact" w:val="259"/>
         </w:trPr>
         <w:tc>
@@ -1700,7 +2288,23 @@
                 <w:sz w:val="22"/>
                 <w:szCs w:val="22"/>
               </w:rPr>
-              <w:t>${gc_code}</w:t>
+              <w:t>${</w:t>
+            </w:r>
+            <w:proofErr w:type="spellStart"/>
+            <w:r>
+              <w:rPr>
+                <w:sz w:val="22"/>
+                <w:szCs w:val="22"/>
+              </w:rPr>
+              <w:t>gc_code</w:t>
+            </w:r>
+            <w:proofErr w:type="spellEnd"/>
+            <w:r>
+              <w:rPr>
+                <w:sz w:val="22"/>
+                <w:szCs w:val="22"/>
+              </w:rPr>
+              <w:t>}</w:t>
             </w:r>
           </w:p>
         </w:tc>
@@ -1713,6 +2317,7 @@
               <w:bottom w:w="14" w:type="dxa"/>
               <w:right w:w="115" w:type="dxa"/>
             </w:tcMar>
+            <w:vAlign w:val="center"/>
           </w:tcPr>
           <w:p>
             <w:pPr>
@@ -1728,7 +2333,25 @@
                 <w:sz w:val="22"/>
                 <w:szCs w:val="22"/>
               </w:rPr>
-              <w:t xml:space="preserve">${gc_title_normal} </w:t>
+              <w:t>${</w:t>
+            </w:r>
+            <w:proofErr w:type="spellStart"/>
+            <w:r>
+              <w:rPr>
+                <w:kern w:val="0"/>
+                <w:sz w:val="22"/>
+                <w:szCs w:val="22"/>
+              </w:rPr>
+              <w:t>gc_title_normal</w:t>
+            </w:r>
+            <w:proofErr w:type="spellEnd"/>
+            <w:r>
+              <w:rPr>
+                <w:kern w:val="0"/>
+                <w:sz w:val="22"/>
+                <w:szCs w:val="22"/>
+              </w:rPr>
+              <w:t xml:space="preserve">} </w:t>
             </w:r>
             <w:r>
               <w:rPr>
@@ -1736,132 +2359,235 @@
                 <w:sz w:val="12"/>
                 <w:szCs w:val="12"/>
               </w:rPr>
-              <w:t>${gc_title_small}</w:t>
-            </w:r>
-          </w:p>
-          <w:p>
-            <w:pPr>
-              <w:rPr>
-                <w:sz w:val="22"/>
-                <w:szCs w:val="22"/>
-              </w:rPr>
-            </w:pPr>
-          </w:p>
-        </w:tc>
-        <w:tc>
-          <w:tcPr>
-            <w:tcW w:w="1530" w:type="dxa"/>
-            <w:tcMar>
-              <w:top w:w="0" w:type="dxa"/>
-              <w:left w:w="115" w:type="dxa"/>
-              <w:bottom w:w="14" w:type="dxa"/>
-              <w:right w:w="115" w:type="dxa"/>
-            </w:tcMar>
-            <w:vAlign w:val="center"/>
-          </w:tcPr>
-          <w:p>
-            <w:pPr>
-              <w:jc w:val="center"/>
-              <w:rPr>
-                <w:sz w:val="22"/>
-                <w:szCs w:val="22"/>
-              </w:rPr>
-            </w:pPr>
-            <w:r>
-              <w:rPr>
-                <w:sz w:val="22"/>
-                <w:szCs w:val="22"/>
-              </w:rPr>
-              <w:t>${gc_units}</w:t>
-            </w:r>
-          </w:p>
-        </w:tc>
-        <w:tc>
-          <w:tcPr>
-            <w:tcW w:w="1116" w:type="dxa"/>
-            <w:tcMar>
-              <w:top w:w="0" w:type="dxa"/>
-              <w:left w:w="115" w:type="dxa"/>
-              <w:bottom w:w="14" w:type="dxa"/>
-              <w:right w:w="115" w:type="dxa"/>
-            </w:tcMar>
-            <w:vAlign w:val="center"/>
-          </w:tcPr>
-          <w:p>
-            <w:pPr>
-              <w:rPr>
-                <w:sz w:val="22"/>
-                <w:szCs w:val="22"/>
-              </w:rPr>
-            </w:pPr>
-            <w:r>
-              <w:rPr>
-                <w:sz w:val="22"/>
-                <w:szCs w:val="22"/>
-              </w:rPr>
-              <w:t>${gc_prereq}</w:t>
-            </w:r>
-          </w:p>
-        </w:tc>
-        <w:tc>
-          <w:tcPr>
-            <w:tcW w:w="954" w:type="dxa"/>
-            <w:tcMar>
-              <w:top w:w="0" w:type="dxa"/>
-              <w:left w:w="115" w:type="dxa"/>
-              <w:bottom w:w="14" w:type="dxa"/>
-              <w:right w:w="115" w:type="dxa"/>
-            </w:tcMar>
-            <w:vAlign w:val="center"/>
-          </w:tcPr>
-          <w:p>
-            <w:pPr>
-              <w:rPr>
-                <w:sz w:val="22"/>
-                <w:szCs w:val="22"/>
-              </w:rPr>
-            </w:pPr>
-            <w:r>
-              <w:rPr>
-                <w:sz w:val="22"/>
-                <w:szCs w:val="22"/>
-              </w:rPr>
-              <w:t>${ac_code}</w:t>
-            </w:r>
-          </w:p>
-        </w:tc>
-        <w:tc>
-          <w:tcPr>
-            <w:tcW w:w="3330" w:type="dxa"/>
-            <w:tcMar>
-              <w:top w:w="0" w:type="dxa"/>
-              <w:left w:w="115" w:type="dxa"/>
-              <w:bottom w:w="14" w:type="dxa"/>
-              <w:right w:w="115" w:type="dxa"/>
-            </w:tcMar>
-          </w:tcPr>
-          <w:p>
-            <w:pPr>
-              <w:rPr>
-                <w:sz w:val="22"/>
-                <w:szCs w:val="22"/>
-              </w:rPr>
-            </w:pPr>
-            <w:r>
-              <w:rPr>
-                <w:kern w:val="0"/>
-                <w:sz w:val="22"/>
-                <w:szCs w:val="22"/>
-              </w:rPr>
-              <w:t xml:space="preserve">${ac_title_normal} </w:t>
-            </w:r>
+              <w:t>${</w:t>
+            </w:r>
+            <w:proofErr w:type="spellStart"/>
             <w:r>
               <w:rPr>
                 <w:kern w:val="0"/>
                 <w:sz w:val="12"/>
                 <w:szCs w:val="12"/>
               </w:rPr>
-              <w:t>${ac_title_small}</w:t>
+              <w:t>gc_title_small</w:t>
+            </w:r>
+            <w:proofErr w:type="spellEnd"/>
+            <w:r>
+              <w:rPr>
+                <w:kern w:val="0"/>
+                <w:sz w:val="12"/>
+                <w:szCs w:val="12"/>
+              </w:rPr>
+              <w:t>}</w:t>
+            </w:r>
+          </w:p>
+          <w:p>
+            <w:pPr>
+              <w:rPr>
+                <w:sz w:val="22"/>
+                <w:szCs w:val="22"/>
+              </w:rPr>
+            </w:pPr>
+          </w:p>
+        </w:tc>
+        <w:tc>
+          <w:tcPr>
+            <w:tcW w:w="1530" w:type="dxa"/>
+            <w:tcMar>
+              <w:top w:w="0" w:type="dxa"/>
+              <w:left w:w="115" w:type="dxa"/>
+              <w:bottom w:w="14" w:type="dxa"/>
+              <w:right w:w="115" w:type="dxa"/>
+            </w:tcMar>
+            <w:vAlign w:val="center"/>
+          </w:tcPr>
+          <w:p>
+            <w:pPr>
+              <w:jc w:val="center"/>
+              <w:rPr>
+                <w:sz w:val="22"/>
+                <w:szCs w:val="22"/>
+              </w:rPr>
+            </w:pPr>
+            <w:r>
+              <w:rPr>
+                <w:sz w:val="22"/>
+                <w:szCs w:val="22"/>
+              </w:rPr>
+              <w:t>${</w:t>
+            </w:r>
+            <w:proofErr w:type="spellStart"/>
+            <w:r>
+              <w:rPr>
+                <w:sz w:val="22"/>
+                <w:szCs w:val="22"/>
+              </w:rPr>
+              <w:t>gc_units</w:t>
+            </w:r>
+            <w:proofErr w:type="spellEnd"/>
+            <w:r>
+              <w:rPr>
+                <w:sz w:val="22"/>
+                <w:szCs w:val="22"/>
+              </w:rPr>
+              <w:t>}</w:t>
+            </w:r>
+          </w:p>
+        </w:tc>
+        <w:tc>
+          <w:tcPr>
+            <w:tcW w:w="1116" w:type="dxa"/>
+            <w:tcMar>
+              <w:top w:w="0" w:type="dxa"/>
+              <w:left w:w="115" w:type="dxa"/>
+              <w:bottom w:w="14" w:type="dxa"/>
+              <w:right w:w="115" w:type="dxa"/>
+            </w:tcMar>
+            <w:vAlign w:val="center"/>
+          </w:tcPr>
+          <w:p>
+            <w:pPr>
+              <w:rPr>
+                <w:sz w:val="22"/>
+                <w:szCs w:val="22"/>
+              </w:rPr>
+            </w:pPr>
+            <w:r>
+              <w:rPr>
+                <w:sz w:val="22"/>
+                <w:szCs w:val="22"/>
+              </w:rPr>
+              <w:t>${</w:t>
+            </w:r>
+            <w:proofErr w:type="spellStart"/>
+            <w:r>
+              <w:rPr>
+                <w:sz w:val="22"/>
+                <w:szCs w:val="22"/>
+              </w:rPr>
+              <w:t>gc_prereq</w:t>
+            </w:r>
+            <w:proofErr w:type="spellEnd"/>
+            <w:r>
+              <w:rPr>
+                <w:sz w:val="22"/>
+                <w:szCs w:val="22"/>
+              </w:rPr>
+              <w:t>}</w:t>
+            </w:r>
+          </w:p>
+        </w:tc>
+        <w:tc>
+          <w:tcPr>
+            <w:tcW w:w="954" w:type="dxa"/>
+            <w:tcMar>
+              <w:top w:w="0" w:type="dxa"/>
+              <w:left w:w="115" w:type="dxa"/>
+              <w:bottom w:w="14" w:type="dxa"/>
+              <w:right w:w="115" w:type="dxa"/>
+            </w:tcMar>
+            <w:vAlign w:val="center"/>
+          </w:tcPr>
+          <w:p>
+            <w:pPr>
+              <w:rPr>
+                <w:sz w:val="22"/>
+                <w:szCs w:val="22"/>
+              </w:rPr>
+            </w:pPr>
+            <w:r>
+              <w:rPr>
+                <w:sz w:val="22"/>
+                <w:szCs w:val="22"/>
+              </w:rPr>
+              <w:t>${</w:t>
+            </w:r>
+            <w:proofErr w:type="spellStart"/>
+            <w:r>
+              <w:rPr>
+                <w:sz w:val="22"/>
+                <w:szCs w:val="22"/>
+              </w:rPr>
+              <w:t>ac_code</w:t>
+            </w:r>
+            <w:proofErr w:type="spellEnd"/>
+            <w:r>
+              <w:rPr>
+                <w:sz w:val="22"/>
+                <w:szCs w:val="22"/>
+              </w:rPr>
+              <w:t>}</w:t>
+            </w:r>
+          </w:p>
+        </w:tc>
+        <w:tc>
+          <w:tcPr>
+            <w:tcW w:w="3330" w:type="dxa"/>
+            <w:tcMar>
+              <w:top w:w="0" w:type="dxa"/>
+              <w:left w:w="115" w:type="dxa"/>
+              <w:bottom w:w="14" w:type="dxa"/>
+              <w:right w:w="115" w:type="dxa"/>
+            </w:tcMar>
+            <w:vAlign w:val="center"/>
+          </w:tcPr>
+          <w:p>
+            <w:pPr>
+              <w:rPr>
+                <w:sz w:val="22"/>
+                <w:szCs w:val="22"/>
+              </w:rPr>
+            </w:pPr>
+            <w:r>
+              <w:rPr>
+                <w:kern w:val="0"/>
+                <w:sz w:val="22"/>
+                <w:szCs w:val="22"/>
+              </w:rPr>
+              <w:t>${</w:t>
+            </w:r>
+            <w:proofErr w:type="spellStart"/>
+            <w:r>
+              <w:rPr>
+                <w:kern w:val="0"/>
+                <w:sz w:val="22"/>
+                <w:szCs w:val="22"/>
+              </w:rPr>
+              <w:t>ac_title_normal</w:t>
+            </w:r>
+            <w:proofErr w:type="spellEnd"/>
+            <w:r>
+              <w:rPr>
+                <w:kern w:val="0"/>
+                <w:sz w:val="22"/>
+                <w:szCs w:val="22"/>
+              </w:rPr>
+              <w:t xml:space="preserve">} </w:t>
+            </w:r>
+            <w:r>
+              <w:rPr>
+                <w:kern w:val="0"/>
+                <w:sz w:val="12"/>
+                <w:szCs w:val="12"/>
+              </w:rPr>
+              <w:t>${</w:t>
+            </w:r>
+            <w:proofErr w:type="spellStart"/>
+            <w:r>
+              <w:rPr>
+                <w:kern w:val="0"/>
+                <w:sz w:val="12"/>
+                <w:szCs w:val="12"/>
+              </w:rPr>
+              <w:t>ac_title_small</w:t>
+            </w:r>
+            <w:proofErr w:type="spellEnd"/>
+            <w:r>
+              <w:rPr>
+                <w:kern w:val="0"/>
+                <w:sz w:val="12"/>
+                <w:szCs w:val="12"/>
+              </w:rPr>
+              <w:t>}</w:t>
             </w:r>
           </w:p>
         </w:tc>
@@ -1889,7 +2615,23 @@
                 <w:sz w:val="22"/>
                 <w:szCs w:val="22"/>
               </w:rPr>
-              <w:t>${ac_units}</w:t>
+              <w:t>${</w:t>
+            </w:r>
+            <w:proofErr w:type="spellStart"/>
+            <w:r>
+              <w:rPr>
+                <w:sz w:val="22"/>
+                <w:szCs w:val="22"/>
+              </w:rPr>
+              <w:t>ac_units</w:t>
+            </w:r>
+            <w:proofErr w:type="spellEnd"/>
+            <w:r>
+              <w:rPr>
+                <w:sz w:val="22"/>
+                <w:szCs w:val="22"/>
+              </w:rPr>
+              <w:t>}</w:t>
             </w:r>
           </w:p>
         </w:tc>
@@ -1939,7 +2681,23 @@
                 <w:sz w:val="22"/>
                 <w:szCs w:val="22"/>
               </w:rPr>
-              <w:t>${total_units_earned}</w:t>
+              <w:t>${</w:t>
+            </w:r>
+            <w:proofErr w:type="spellStart"/>
+            <w:r>
+              <w:rPr>
+                <w:sz w:val="22"/>
+                <w:szCs w:val="22"/>
+              </w:rPr>
+              <w:t>total_units_earned</w:t>
+            </w:r>
+            <w:proofErr w:type="spellEnd"/>
+            <w:r>
+              <w:rPr>
+                <w:sz w:val="22"/>
+                <w:szCs w:val="22"/>
+              </w:rPr>
+              <w:t>}</w:t>
             </w:r>
           </w:p>
         </w:tc>
@@ -1967,8 +2725,17 @@
                 <w:sz w:val="22"/>
                 <w:szCs w:val="22"/>
               </w:rPr>
-              <w:t>Total number of units to be enrolled :</w:t>
-            </w:r>
+              <w:t xml:space="preserve">Total number of units to be </w:t>
+            </w:r>
+            <w:proofErr w:type="gramStart"/>
+            <w:r>
+              <w:rPr>
+                <w:sz w:val="22"/>
+                <w:szCs w:val="22"/>
+              </w:rPr>
+              <w:t>enrolled :</w:t>
+            </w:r>
+            <w:proofErr w:type="gramEnd"/>
             <w:r>
               <w:rPr>
                 <w:sz w:val="22"/>
@@ -1981,7 +2748,23 @@
                 <w:sz w:val="22"/>
                 <w:szCs w:val="22"/>
               </w:rPr>
-              <w:t>${total_units_to_enroll}</w:t>
+              <w:t>${</w:t>
+            </w:r>
+            <w:proofErr w:type="spellStart"/>
+            <w:r>
+              <w:rPr>
+                <w:sz w:val="22"/>
+                <w:szCs w:val="22"/>
+              </w:rPr>
+              <w:t>total_units_to_enroll</w:t>
+            </w:r>
+            <w:proofErr w:type="spellEnd"/>
+            <w:r>
+              <w:rPr>
+                <w:sz w:val="22"/>
+                <w:szCs w:val="22"/>
+              </w:rPr>
+              <w:t>}</w:t>
             </w:r>
           </w:p>
         </w:tc>
@@ -2018,7 +2801,23 @@
                 <w:sz w:val="22"/>
                 <w:szCs w:val="22"/>
               </w:rPr>
-              <w:t xml:space="preserve">Student’s Signature : </w:t>
+              <w:t xml:space="preserve">Student’s </w:t>
+            </w:r>
+            <w:proofErr w:type="gramStart"/>
+            <w:r>
+              <w:rPr>
+                <w:sz w:val="22"/>
+                <w:szCs w:val="22"/>
+              </w:rPr>
+              <w:t>Signature :</w:t>
+            </w:r>
+            <w:proofErr w:type="gramEnd"/>
+            <w:r>
+              <w:rPr>
+                <w:sz w:val="22"/>
+                <w:szCs w:val="22"/>
+              </w:rPr>
+              <w:t xml:space="preserve"> </w:t>
             </w:r>
           </w:p>
         </w:tc>
@@ -2046,8 +2845,17 @@
                 <w:sz w:val="22"/>
                 <w:szCs w:val="22"/>
               </w:rPr>
-              <w:t>Adviser’s printed Name :</w:t>
-            </w:r>
+              <w:t xml:space="preserve">Adviser’s printed </w:t>
+            </w:r>
+            <w:proofErr w:type="gramStart"/>
+            <w:r>
+              <w:rPr>
+                <w:sz w:val="22"/>
+                <w:szCs w:val="22"/>
+              </w:rPr>
+              <w:t>Name :</w:t>
+            </w:r>
+            <w:proofErr w:type="gramEnd"/>
             <w:r>
               <w:rPr>
                 <w:sz w:val="22"/>
@@ -2060,7 +2868,23 @@
                 <w:sz w:val="22"/>
                 <w:szCs w:val="22"/>
               </w:rPr>
-              <w:t>${advisor_name}</w:t>
+              <w:t>${</w:t>
+            </w:r>
+            <w:proofErr w:type="spellStart"/>
+            <w:r>
+              <w:rPr>
+                <w:sz w:val="22"/>
+                <w:szCs w:val="22"/>
+              </w:rPr>
+              <w:t>advisor_name</w:t>
+            </w:r>
+            <w:proofErr w:type="spellEnd"/>
+            <w:r>
+              <w:rPr>
+                <w:sz w:val="22"/>
+                <w:szCs w:val="22"/>
+              </w:rPr>
+              <w:t>}</w:t>
             </w:r>
           </w:p>
         </w:tc>
@@ -2123,7 +2947,23 @@
                 <w:sz w:val="22"/>
                 <w:szCs w:val="22"/>
               </w:rPr>
-              <w:t xml:space="preserve">Adviser’s Signature : </w:t>
+              <w:t xml:space="preserve">Adviser’s </w:t>
+            </w:r>
+            <w:proofErr w:type="gramStart"/>
+            <w:r>
+              <w:rPr>
+                <w:sz w:val="22"/>
+                <w:szCs w:val="22"/>
+              </w:rPr>
+              <w:t>Signature :</w:t>
+            </w:r>
+            <w:proofErr w:type="gramEnd"/>
+            <w:r>
+              <w:rPr>
+                <w:sz w:val="22"/>
+                <w:szCs w:val="22"/>
+              </w:rPr>
+              <w:t xml:space="preserve"> </w:t>
             </w:r>
           </w:p>
         </w:tc>

</xml_diff>